<commit_message>
feat: v4.1 — per-lab folders with assets; Linux/Kubernetes/Docker environments
Restructure every lab into its own folder (labs/lab-NN-<slug>/) with supporting
assets, and add the three lab environments across the courseware:

- Each lab folder now carries the guide (.md) plus guidelines/cheatsheet/worksheet
  PDFs; 9 data-bearing labs (1,2,3,8,12,17,24,26,27) also ship CSV + Excel mock data.
- Bonus container/Kubernetes assets: Dockerfiles + docker-compose (labs 10, 15),
  Kubernetes deployment/service YAML (labs 14, 15) and shell scripts (lab 16).
- New "Lab Environments" slide + Learner Guide section: Linux (Killercoda Ubuntu),
  Kubernetes (Killercoda Kubernetes) and Docker (Docker Desktop).
- Rebuild deck (402 slides), Lesson Plan and Learner Guide at v4.1 with updated
  Document Version Control Records; archive the superseded v4.0 deck.

Co-Authored-By: Claude Fable 5 <noreply@anthropic.com>
</commit_message>
<xml_diff>
--- a/LG-CompTIA Certified Server Plus Training.docx
+++ b/LG-CompTIA Certified Server Plus Training.docx
@@ -179,7 +179,7 @@
           <w:color w:val="1F6FEB"/>
           <w:sz w:val="24"/>
         </w:rPr>
-        <w:t>Version 4.0</w:t>
+        <w:t>Version 4.1</w:t>
       </w:r>
     </w:p>
     <w:p>
@@ -399,6 +399,64 @@
           </w:p>
         </w:tc>
       </w:tr>
+      <w:tr>
+        <w:tc>
+          <w:tcPr>
+            <w:tcW w:type="dxa" w:w="2160"/>
+          </w:tcPr>
+          <w:p>
+            <w:r/>
+            <w:r>
+              <w:rPr>
+                <w:sz w:val="19"/>
+              </w:rPr>
+              <w:t>4.1</w:t>
+            </w:r>
+          </w:p>
+        </w:tc>
+        <w:tc>
+          <w:tcPr>
+            <w:tcW w:type="dxa" w:w="2160"/>
+          </w:tcPr>
+          <w:p>
+            <w:r/>
+            <w:r>
+              <w:rPr>
+                <w:sz w:val="19"/>
+              </w:rPr>
+              <w:t>19 August 2026</w:t>
+            </w:r>
+          </w:p>
+        </w:tc>
+        <w:tc>
+          <w:tcPr>
+            <w:tcW w:type="dxa" w:w="2160"/>
+          </w:tcPr>
+          <w:p>
+            <w:r/>
+            <w:r>
+              <w:rPr>
+                <w:sz w:val="19"/>
+              </w:rPr>
+              <w:t>Restructured each lab into its own folder with guidelines/cheatsheet/worksheet PDFs and CSV+Excel mock data; added Linux/Kubernetes/Docker lab environments and bonus container/Kubernetes assets (Dockerfiles, Compose, Kubernetes YAML, shell scripts).</w:t>
+            </w:r>
+          </w:p>
+        </w:tc>
+        <w:tc>
+          <w:tcPr>
+            <w:tcW w:type="dxa" w:w="2160"/>
+          </w:tcPr>
+          <w:p>
+            <w:r/>
+            <w:r>
+              <w:rPr>
+                <w:sz w:val="19"/>
+              </w:rPr>
+              <w:t>Dr Alfred Ang</w:t>
+            </w:r>
+          </w:p>
+        </w:tc>
+      </w:tr>
     </w:tbl>
     <w:p>
       <w:r>
@@ -491,7 +549,7 @@
         </w:rPr>
         <w:t>Topic 01 — Server Hardware Installation and Management  (18%)</w:t>
         <w:tab/>
-        <w:t>6</w:t>
+        <w:t>7</w:t>
       </w:r>
     </w:p>
     <w:p>
@@ -610,7 +668,7 @@
         </w:rPr>
         <w:t>Topic 02 — Server Administration  (30%)</w:t>
         <w:tab/>
-        <w:t>12</w:t>
+        <w:t>13</w:t>
       </w:r>
     </w:p>
     <w:p>
@@ -750,7 +808,7 @@
         </w:rPr>
         <w:t>Lab 12 — Performance Monitoring, Baselining, Event Logs</w:t>
         <w:tab/>
-        <w:t>19</w:t>
+        <w:t>20</w:t>
       </w:r>
     </w:p>
     <w:p>
@@ -770,7 +828,7 @@
         </w:rPr>
         <w:t>Lab 13 — Data Migration and Transfer</w:t>
         <w:tab/>
-        <w:t>20</w:t>
+        <w:t>21</w:t>
       </w:r>
     </w:p>
     <w:p>
@@ -790,7 +848,7 @@
         </w:rPr>
         <w:t>Lab 14 — High Availability: Clustering, Load Balancing, NIC Teaming</w:t>
         <w:tab/>
-        <w:t>21</w:t>
+        <w:t>22</w:t>
       </w:r>
     </w:p>
     <w:p>
@@ -810,7 +868,7 @@
         </w:rPr>
         <w:t>Lab 15 — Virtualization with KVM / QEMU</w:t>
         <w:tab/>
-        <w:t>22</w:t>
+        <w:t>23</w:t>
       </w:r>
     </w:p>
     <w:p>
@@ -830,7 +888,7 @@
         </w:rPr>
         <w:t>Lab 16 — Scripting Basics for Server Administration</w:t>
         <w:tab/>
-        <w:t>23</w:t>
+        <w:t>24</w:t>
       </w:r>
     </w:p>
     <w:p>
@@ -850,7 +908,7 @@
         </w:rPr>
         <w:t>Lab 17 — Asset Management, Documentation, and Licensing</w:t>
         <w:tab/>
-        <w:t>24</w:t>
+        <w:t>25</w:t>
       </w:r>
     </w:p>
     <w:p>
@@ -869,7 +927,7 @@
         </w:rPr>
         <w:t>Topic 03 — Security and Disaster Recovery  (24%)</w:t>
         <w:tab/>
-        <w:t>25</w:t>
+        <w:t>26</w:t>
       </w:r>
     </w:p>
     <w:p>
@@ -1009,7 +1067,7 @@
         </w:rPr>
         <w:t>Lab 24 — Patch and Update Management</w:t>
         <w:tab/>
-        <w:t>32</w:t>
+        <w:t>33</w:t>
       </w:r>
     </w:p>
     <w:p>
@@ -1029,7 +1087,7 @@
         </w:rPr>
         <w:t>Lab 25 — Secure Decommissioning and Media Destruction</w:t>
         <w:tab/>
-        <w:t>33</w:t>
+        <w:t>34</w:t>
       </w:r>
     </w:p>
     <w:p>
@@ -1049,7 +1107,7 @@
         </w:rPr>
         <w:t>Lab 26 — Backup Strategy: Full, Incremental, Differential, Snapshot</w:t>
         <w:tab/>
-        <w:t>34</w:t>
+        <w:t>35</w:t>
       </w:r>
     </w:p>
     <w:p>
@@ -1069,7 +1127,7 @@
         </w:rPr>
         <w:t>Lab 27 — Disaster Recovery: Replication and Site Failover</w:t>
         <w:tab/>
-        <w:t>35</w:t>
+        <w:t>36</w:t>
       </w:r>
     </w:p>
     <w:p>
@@ -1088,7 +1146,7 @@
         </w:rPr>
         <w:t>Topic 04 — Troubleshooting  (28%)</w:t>
         <w:tab/>
-        <w:t>36</w:t>
+        <w:t>37</w:t>
       </w:r>
     </w:p>
     <w:p>
@@ -1188,7 +1246,7 @@
         </w:rPr>
         <w:t>Lab 32 — Network Connectivity Troubleshooting</w:t>
         <w:tab/>
-        <w:t>41</w:t>
+        <w:t>42</w:t>
       </w:r>
     </w:p>
     <w:p>
@@ -1208,7 +1266,7 @@
         </w:rPr>
         <w:t>Lab 33 — Security Troubleshooting</w:t>
         <w:tab/>
-        <w:t>42</w:t>
+        <w:t>43</w:t>
       </w:r>
     </w:p>
     <w:p>
@@ -1227,7 +1285,7 @@
         </w:rPr>
         <w:t>Exam Focus — Cross-Cutting Server+ Topics</w:t>
         <w:tab/>
-        <w:t>43</w:t>
+        <w:t>44</w:t>
       </w:r>
     </w:p>
     <w:p>
@@ -1346,6 +1404,50 @@
           <w:color w:val="1F6FEB"/>
           <w:sz w:val="22"/>
         </w:rPr>
+        <w:t>Lab environments</w:t>
+      </w:r>
+    </w:p>
+    <w:p>
+      <w:r>
+        <w:t>The 33 core labs run on the free Killercoda Ubuntu (Linux) playground. A few labs also ship bonus container and Kubernetes assets that run on Docker Desktop or the Killercoda Kubernetes playground:</w:t>
+      </w:r>
+    </w:p>
+    <w:p>
+      <w:pPr>
+        <w:pStyle w:val="ListBullet"/>
+      </w:pPr>
+      <w:r>
+        <w:t>Linux (all core labs) — Killercoda Ubuntu playground: https://killercoda.com/playgrounds/scenario/ubuntu</w:t>
+      </w:r>
+    </w:p>
+    <w:p>
+      <w:pPr>
+        <w:pStyle w:val="ListBullet"/>
+      </w:pPr>
+      <w:r>
+        <w:t>Kubernetes (bonus assets, Labs 14 &amp; 15) — Killercoda Kubernetes playground: https://killercoda.com/playgrounds/scenario/kubernetes</w:t>
+      </w:r>
+    </w:p>
+    <w:p>
+      <w:pPr>
+        <w:pStyle w:val="ListBullet"/>
+      </w:pPr>
+      <w:r>
+        <w:t>Docker (bonus assets, Labs 10 &amp; 15) — Docker Desktop: https://www.docker.com/products/docker-desktop/</w:t>
+      </w:r>
+    </w:p>
+    <w:p>
+      <w:r>
+        <w:t>Each lab is its own folder in labs/ (e.g. labs/lab-02-raid-mdadm/) containing the guide (.md), a printable guidelines PDF, a cheatsheet PDF and a fill-in worksheet PDF, plus CSV+Excel mock data for data-bearing labs and Dockerfiles / Kubernetes YAML / shell scripts where relevant.</w:t>
+      </w:r>
+    </w:p>
+    <w:p>
+      <w:r>
+        <w:rPr>
+          <w:b/>
+          <w:color w:val="1F6FEB"/>
+          <w:sz w:val="22"/>
+        </w:rPr>
         <w:t>What you need</w:t>
       </w:r>
     </w:p>
@@ -1354,7 +1456,7 @@
         <w:pStyle w:val="ListBullet"/>
       </w:pPr>
       <w:r>
-        <w:t>A web browser — every lab runs on the free Killercoda Ubuntu playground: https://killercoda.com/playgrounds/scenario/ubuntu</w:t>
+        <w:t>A web browser — every core lab runs on the free Killercoda Ubuntu playground: https://killercoda.com/playgrounds/scenario/ubuntu</w:t>
       </w:r>
     </w:p>
     <w:p>
@@ -1363,6 +1465,14 @@
       </w:pPr>
       <w:r>
         <w:t>No local install or physical hardware is required. Each package is pulled with apt (or a single binary download) inside the throw-away VM.</w:t>
+      </w:r>
+    </w:p>
+    <w:p>
+      <w:pPr>
+        <w:pStyle w:val="ListBullet"/>
+      </w:pPr>
+      <w:r>
+        <w:t>For the bonus container labs: Docker Desktop (https://www.docker.com/products/docker-desktop/) and the Killercoda Kubernetes playground.</w:t>
       </w:r>
     </w:p>
     <w:p>

</xml_diff>